<commit_message>
TAP itens 3 e 4
</commit_message>
<xml_diff>
--- a/docs/TermoAberturaProjetoNPJ.docx
+++ b/docs/TermoAberturaProjetoNPJ.docx
@@ -261,7 +261,6 @@
     </w:p>
     <w:p>
       <w:pPr>
-        <w:spacing w:after="0"/>
         <w:jc w:val="both"/>
         <w:rPr>
           <w:rFonts w:ascii="Arial" w:hAnsi="Arial" w:cs="Arial"/>
@@ -299,39 +298,7 @@
           <w:sz w:val="24"/>
           <w:szCs w:val="24"/>
         </w:rPr>
-        <w:t>De acordo com observações no ambiente de trabalho a p</w:t>
-      </w:r>
-      <w:r>
-        <w:rPr>
-          <w:rFonts w:ascii="Arial" w:hAnsi="Arial" w:cs="Arial"/>
-          <w:sz w:val="24"/>
-          <w:szCs w:val="24"/>
-        </w:rPr>
-        <w:t xml:space="preserve">lanilha </w:t>
-      </w:r>
-      <w:r>
-        <w:rPr>
-          <w:rFonts w:ascii="Arial" w:hAnsi="Arial" w:cs="Arial"/>
-          <w:sz w:val="24"/>
-          <w:szCs w:val="24"/>
-        </w:rPr>
-        <w:t xml:space="preserve">utilizada para cadastro de usuários </w:t>
-      </w:r>
-      <w:r>
-        <w:rPr>
-          <w:rFonts w:ascii="Arial" w:hAnsi="Arial" w:cs="Arial"/>
-          <w:sz w:val="24"/>
-          <w:szCs w:val="24"/>
-        </w:rPr>
-        <w:t>contém um excesso de informações, incluindo atualizações dos casos, o que dificulta tanto a consulta quanto a manutenção dos registros.</w:t>
-      </w:r>
-      <w:r>
-        <w:rPr>
-          <w:rFonts w:ascii="Arial" w:hAnsi="Arial" w:cs="Arial"/>
-          <w:sz w:val="24"/>
-          <w:szCs w:val="24"/>
-        </w:rPr>
-        <w:t xml:space="preserve"> Também há um retrabalho ao passar as informações do formulário físico para a planilha.</w:t>
+        <w:t xml:space="preserve">No ambiente de trabalho do Núcleo de Práticas Jurídicas (NPJ), observa-se que a planilha atualmente utilizada para o cadastro de usuários contém um excesso de informações, incluindo dados de beneficiários e atualizações de casos, o que torna a consulta e a manutenção dos registros confusas e demoradas. Esse problema é agravado pelo retrabalho gerado ao transferir manualmente as informações de formulários físicos para o Excel, um processo sujeito a erros e inconsistências. A implementação de um sistema informatizado que automatize o cadastro e organize os dados em uma estrutura intuitiva e de fácil entendimento trará maior produtividade à equipe, eliminando redundâncias </w:t>
       </w:r>
     </w:p>
     <w:p>
@@ -340,10 +307,20 @@
         <w:jc w:val="both"/>
         <w:rPr>
           <w:rFonts w:ascii="Arial" w:hAnsi="Arial" w:cs="Arial"/>
-          <w:sz w:val="24"/>
-          <w:szCs w:val="24"/>
-        </w:rPr>
-      </w:pPr>
+          <w:b/>
+          <w:bCs/>
+          <w:sz w:val="24"/>
+          <w:szCs w:val="24"/>
+        </w:rPr>
+      </w:pPr>
+      <w:r>
+        <w:rPr>
+          <w:rFonts w:ascii="Arial" w:hAnsi="Arial" w:cs="Arial"/>
+          <w:sz w:val="24"/>
+          <w:szCs w:val="24"/>
+        </w:rPr>
+        <w:t>e facilitando o acesso às informações.</w:t>
+      </w:r>
       <w:r>
         <w:rPr>
           <w:rFonts w:ascii="Arial" w:hAnsi="Arial" w:cs="Arial"/>
@@ -353,38 +330,6 @@
           <w:szCs w:val="24"/>
         </w:rPr>
         <w:tab/>
-      </w:r>
-      <w:r>
-        <w:rPr>
-          <w:rFonts w:ascii="Arial" w:hAnsi="Arial" w:cs="Arial"/>
-          <w:sz w:val="24"/>
-          <w:szCs w:val="24"/>
-        </w:rPr>
-        <w:t xml:space="preserve">O trabalho com lembretes por post-its pode ser </w:t>
-      </w:r>
-      <w:r>
-        <w:rPr>
-          <w:rFonts w:ascii="Arial" w:hAnsi="Arial" w:cs="Arial"/>
-          <w:sz w:val="24"/>
-          <w:szCs w:val="24"/>
-        </w:rPr>
-        <w:t>um método pouco eficiente e sujeito a perdas</w:t>
-      </w:r>
-      <w:r>
-        <w:rPr>
-          <w:rFonts w:ascii="Arial" w:hAnsi="Arial" w:cs="Arial"/>
-          <w:sz w:val="24"/>
-          <w:szCs w:val="24"/>
-        </w:rPr>
-        <w:t xml:space="preserve"> de prazos importantes</w:t>
-      </w:r>
-      <w:r>
-        <w:rPr>
-          <w:rFonts w:ascii="Arial" w:hAnsi="Arial" w:cs="Arial"/>
-          <w:sz w:val="24"/>
-          <w:szCs w:val="24"/>
-        </w:rPr>
-        <w:t>. Então mais de uma forma de lembrar determinada tarefa, seja por email, notificação via e também os post-its pode ser uma alternativa mais acertiva.</w:t>
       </w:r>
     </w:p>
     <w:p>
@@ -404,7 +349,39 @@
           <w:sz w:val="24"/>
           <w:szCs w:val="24"/>
         </w:rPr>
-        <w:t>O armazenamento físico de documentos pode aumentar o risco de perdas e dificulta o acesso rápido às informações. Com a digitalização destes documentos, seria muito mais prática a consulta e posterior exclusão quando necessário.</w:t>
+        <w:t xml:space="preserve">O trabalho com lembretes por post-its pode ser </w:t>
+      </w:r>
+      <w:r>
+        <w:rPr>
+          <w:rFonts w:ascii="Arial" w:hAnsi="Arial" w:cs="Arial"/>
+          <w:sz w:val="24"/>
+          <w:szCs w:val="24"/>
+        </w:rPr>
+        <w:t>um método pouco eficiente e sujeito a perdas</w:t>
+      </w:r>
+      <w:r>
+        <w:rPr>
+          <w:rFonts w:ascii="Arial" w:hAnsi="Arial" w:cs="Arial"/>
+          <w:sz w:val="24"/>
+          <w:szCs w:val="24"/>
+        </w:rPr>
+        <w:t xml:space="preserve"> de prazos importantes</w:t>
+      </w:r>
+      <w:r>
+        <w:rPr>
+          <w:rFonts w:ascii="Arial" w:hAnsi="Arial" w:cs="Arial"/>
+          <w:sz w:val="24"/>
+          <w:szCs w:val="24"/>
+        </w:rPr>
+        <w:t xml:space="preserve">. </w:t>
+      </w:r>
+      <w:r>
+        <w:rPr>
+          <w:rFonts w:ascii="Arial" w:hAnsi="Arial" w:cs="Arial"/>
+          <w:sz w:val="24"/>
+          <w:szCs w:val="24"/>
+        </w:rPr>
+        <w:t>A substituição desse modelo por um sistema que ofereça múltiplas formas de notificação como e-mails, alertas na interface gráfica e, opcionalmente, a manutenção dos post-its como apoio proporcionará uma abordagem mais confiável e adaptada às necessidades da equipe, reduzindo riscos e aumentando a assertividade no controle de tarefas e agendamentos.</w:t>
       </w:r>
     </w:p>
     <w:p>
@@ -424,6 +401,74 @@
           <w:sz w:val="24"/>
           <w:szCs w:val="24"/>
         </w:rPr>
+        <w:lastRenderedPageBreak/>
+        <w:t>O armazenamento físico de documentos pode aumentar o risco de perdas e dificulta o acesso rápido às informações. Com a digitalização destes documentos</w:t>
+      </w:r>
+      <w:r>
+        <w:rPr>
+          <w:rFonts w:ascii="Arial" w:hAnsi="Arial" w:cs="Arial"/>
+          <w:sz w:val="24"/>
+          <w:szCs w:val="24"/>
+        </w:rPr>
+        <w:t xml:space="preserve"> </w:t>
+      </w:r>
+      <w:r>
+        <w:rPr>
+          <w:rFonts w:ascii="Arial" w:hAnsi="Arial" w:cs="Arial"/>
+          <w:sz w:val="24"/>
+          <w:szCs w:val="24"/>
+        </w:rPr>
+        <w:t>a consulta se tornará mais prática e segura, permitindo o arquivamento eficiente, a recuperação instantânea de dados e o descarte digital quando necessário, otimizando recursos</w:t>
+      </w:r>
+      <w:r>
+        <w:t xml:space="preserve"> </w:t>
+      </w:r>
+      <w:r>
+        <w:rPr>
+          <w:rFonts w:ascii="Arial" w:hAnsi="Arial" w:cs="Arial"/>
+          <w:sz w:val="24"/>
+          <w:szCs w:val="24"/>
+        </w:rPr>
+        <w:t>e minimizando custos operacionais.</w:t>
+      </w:r>
+    </w:p>
+    <w:p>
+      <w:pPr>
+        <w:spacing w:after="0"/>
+        <w:ind w:firstLine="708"/>
+        <w:jc w:val="both"/>
+        <w:rPr>
+          <w:rFonts w:ascii="Arial" w:hAnsi="Arial" w:cs="Arial"/>
+          <w:sz w:val="24"/>
+          <w:szCs w:val="24"/>
+        </w:rPr>
+      </w:pPr>
+      <w:r>
+        <w:rPr>
+          <w:rFonts w:ascii="Arial" w:hAnsi="Arial" w:cs="Arial"/>
+          <w:sz w:val="24"/>
+          <w:szCs w:val="24"/>
+        </w:rPr>
+        <w:t>Além disso, a falta de uma gerência centralizada dos processos força os estagiários a dependerem de autorizações constantes dos supervisores para acessar ou atualizar informações, gerando atrasos e sobrecarga na supervisão. Um sistema integrado resolverá essa questão ao oferecer controle de acesso supervisionado, permitindo que estagiários e advogados trabalhem de forma mais autônoma e ágil, sob a coordenação adequada.</w:t>
+      </w:r>
+    </w:p>
+    <w:p>
+      <w:pPr>
+        <w:spacing w:after="0"/>
+        <w:ind w:firstLine="708"/>
+        <w:jc w:val="both"/>
+        <w:rPr>
+          <w:rFonts w:ascii="Arial" w:hAnsi="Arial" w:cs="Arial"/>
+          <w:sz w:val="24"/>
+          <w:szCs w:val="24"/>
+        </w:rPr>
+      </w:pPr>
+      <w:r>
+        <w:rPr>
+          <w:rFonts w:ascii="Arial" w:hAnsi="Arial" w:cs="Arial"/>
+          <w:sz w:val="24"/>
+          <w:szCs w:val="24"/>
+        </w:rPr>
         <w:t>A</w:t>
       </w:r>
       <w:r>
@@ -469,6 +514,47 @@
     </w:p>
     <w:p>
       <w:pPr>
+        <w:spacing w:before="240" w:after="0"/>
+        <w:jc w:val="both"/>
+        <w:rPr>
+          <w:rFonts w:ascii="Arial" w:hAnsi="Arial" w:cs="Arial"/>
+          <w:sz w:val="24"/>
+          <w:szCs w:val="24"/>
+        </w:rPr>
+      </w:pPr>
+      <w:r>
+        <w:rPr>
+          <w:rFonts w:ascii="Arial" w:hAnsi="Arial" w:cs="Arial"/>
+          <w:sz w:val="24"/>
+          <w:szCs w:val="24"/>
+        </w:rPr>
+        <w:tab/>
+      </w:r>
+    </w:p>
+    <w:p>
+      <w:pPr>
+        <w:jc w:val="both"/>
+        <w:rPr>
+          <w:rFonts w:ascii="Arial" w:hAnsi="Arial" w:cs="Arial"/>
+          <w:b/>
+          <w:bCs/>
+          <w:sz w:val="24"/>
+          <w:szCs w:val="24"/>
+        </w:rPr>
+      </w:pPr>
+      <w:r>
+        <w:rPr>
+          <w:rFonts w:ascii="Arial" w:hAnsi="Arial" w:cs="Arial"/>
+          <w:b/>
+          <w:bCs/>
+          <w:sz w:val="24"/>
+          <w:szCs w:val="24"/>
+        </w:rPr>
+        <w:t>Propósito do Projeto e Metas</w:t>
+      </w:r>
+    </w:p>
+    <w:p>
+      <w:pPr>
         <w:spacing w:after="0"/>
         <w:jc w:val="both"/>
         <w:rPr>
@@ -480,14 +566,56 @@
       <w:r>
         <w:rPr>
           <w:rFonts w:ascii="Arial" w:hAnsi="Arial" w:cs="Arial"/>
+          <w:b/>
+          <w:bCs/>
           <w:sz w:val="24"/>
           <w:szCs w:val="24"/>
         </w:rPr>
         <w:tab/>
       </w:r>
-    </w:p>
-    <w:p>
-      <w:pPr>
+      <w:r>
+        <w:rPr>
+          <w:rFonts w:ascii="Arial" w:hAnsi="Arial" w:cs="Arial"/>
+          <w:sz w:val="24"/>
+          <w:szCs w:val="24"/>
+        </w:rPr>
+        <w:t>O propósito do projeto é promover a digitalização e a automatização dos processos de trabalho identificados no Núcleo de Práticas Jurídicas (NPJ), trazendo maior fluidez, eficiência e organização às atividades realizadas por estagiários e advogados supervisores. A solução sistêmica a ser desenvolvida visa centralizar em uma única plataforma todos os procedimentos que atualmente são realizados de forma manual e fragmentada, integrando desde o pré-cadastro de beneficiários até o fechamento de casos e o arquivamento de documentos. Com isso, o sistema eliminará a dependência de formulários impressos, planilhas desestruturadas, lembretes informais em post-its e arquivamento físico, substituindo-os por uma interface intuitiva que otimize o fluxo de trabalho e melhore a qualidade do atendimento aos beneficiários.</w:t>
+      </w:r>
+      <w:r>
+        <w:rPr>
+          <w:rFonts w:ascii="Arial" w:hAnsi="Arial" w:cs="Arial"/>
+          <w:sz w:val="24"/>
+          <w:szCs w:val="24"/>
+        </w:rPr>
+        <w:t xml:space="preserve"> </w:t>
+      </w:r>
+    </w:p>
+    <w:p>
+      <w:pPr>
+        <w:jc w:val="both"/>
+        <w:rPr>
+          <w:rFonts w:ascii="Arial" w:hAnsi="Arial" w:cs="Arial"/>
+          <w:sz w:val="24"/>
+          <w:szCs w:val="24"/>
+        </w:rPr>
+      </w:pPr>
+      <w:r>
+        <w:rPr>
+          <w:rFonts w:ascii="Arial" w:hAnsi="Arial" w:cs="Arial"/>
+          <w:sz w:val="24"/>
+          <w:szCs w:val="24"/>
+        </w:rPr>
+        <w:tab/>
+        <w:t xml:space="preserve">Os objetivos específicos do projeto incluem: </w:t>
+      </w:r>
+    </w:p>
+    <w:p>
+      <w:pPr>
+        <w:pStyle w:val="PargrafodaLista"/>
+        <w:numPr>
+          <w:ilvl w:val="0"/>
+          <w:numId w:val="1"/>
+        </w:numPr>
         <w:spacing w:after="0"/>
         <w:jc w:val="both"/>
         <w:rPr>
@@ -496,44 +624,206 @@
           <w:szCs w:val="24"/>
         </w:rPr>
       </w:pPr>
-    </w:p>
-    <w:p>
-      <w:pPr>
-        <w:jc w:val="both"/>
-        <w:rPr>
-          <w:rFonts w:ascii="Arial" w:hAnsi="Arial" w:cs="Arial"/>
-          <w:b/>
-          <w:bCs/>
-          <w:sz w:val="24"/>
-          <w:szCs w:val="24"/>
-        </w:rPr>
-      </w:pPr>
-      <w:r>
-        <w:rPr>
-          <w:rFonts w:ascii="Arial" w:hAnsi="Arial" w:cs="Arial"/>
-          <w:b/>
-          <w:bCs/>
+      <w:r>
+        <w:rPr>
+          <w:rFonts w:ascii="Arial" w:hAnsi="Arial" w:cs="Arial"/>
+          <w:b/>
+          <w:bCs/>
+          <w:sz w:val="24"/>
+          <w:szCs w:val="24"/>
+        </w:rPr>
+        <w:t xml:space="preserve">Cadastro de clientes: </w:t>
+      </w:r>
+      <w:r>
+        <w:rPr>
+          <w:rFonts w:ascii="Arial" w:hAnsi="Arial" w:cs="Arial"/>
+          <w:sz w:val="24"/>
+          <w:szCs w:val="24"/>
+        </w:rPr>
+        <w:t>Automatizar o processo de cadastro de beneficiários, substituindo o preenchimento manual de formulários e a inserção em planilhas por um módulo digital que permita o registro rápido, a consulta simplificada e a atualização centralizada de informações, reduzindo retrabalho e erros.</w:t>
+      </w:r>
+    </w:p>
+    <w:p>
+      <w:pPr>
+        <w:pStyle w:val="PargrafodaLista"/>
+        <w:numPr>
+          <w:ilvl w:val="0"/>
+          <w:numId w:val="1"/>
+        </w:numPr>
+        <w:spacing w:after="0"/>
+        <w:jc w:val="both"/>
+        <w:rPr>
+          <w:rFonts w:ascii="Arial" w:hAnsi="Arial" w:cs="Arial"/>
+          <w:sz w:val="24"/>
+          <w:szCs w:val="24"/>
+        </w:rPr>
+      </w:pPr>
+      <w:r>
+        <w:rPr>
+          <w:rFonts w:ascii="Arial" w:hAnsi="Arial" w:cs="Arial"/>
+          <w:b/>
+          <w:bCs/>
+          <w:sz w:val="24"/>
+          <w:szCs w:val="24"/>
+        </w:rPr>
+        <w:t>Controle de documentos e processos:</w:t>
+      </w:r>
+      <w:r>
+        <w:rPr>
+          <w:rFonts w:ascii="Arial" w:hAnsi="Arial" w:cs="Arial"/>
+          <w:sz w:val="24"/>
+          <w:szCs w:val="24"/>
+        </w:rPr>
+        <w:t xml:space="preserve"> Implementar uma gestão digital integrada para o armazenamento, organização e acompanhamento de documentos e processos, eliminando o arquivamento físico em armários e facilitando o acesso rápido às informações por meio de uma estrutura segura, pesquisável e com descarte digital quando necessário.</w:t>
+      </w:r>
+    </w:p>
+    <w:p>
+      <w:pPr>
+        <w:pStyle w:val="PargrafodaLista"/>
+        <w:numPr>
+          <w:ilvl w:val="0"/>
+          <w:numId w:val="1"/>
+        </w:numPr>
+        <w:spacing w:after="0"/>
+        <w:jc w:val="both"/>
+        <w:rPr>
+          <w:rFonts w:ascii="Arial" w:hAnsi="Arial" w:cs="Arial"/>
+          <w:b/>
+          <w:bCs/>
+          <w:sz w:val="24"/>
+          <w:szCs w:val="24"/>
+        </w:rPr>
+      </w:pPr>
+      <w:r>
+        <w:rPr>
+          <w:rFonts w:ascii="Arial" w:hAnsi="Arial" w:cs="Arial"/>
+          <w:b/>
+          <w:bCs/>
+          <w:sz w:val="24"/>
+          <w:szCs w:val="24"/>
+        </w:rPr>
+        <w:t>Agendamentos</w:t>
+      </w:r>
+      <w:r>
+        <w:rPr>
+          <w:rFonts w:ascii="Arial" w:hAnsi="Arial" w:cs="Arial"/>
+          <w:b/>
+          <w:bCs/>
+          <w:sz w:val="24"/>
+          <w:szCs w:val="24"/>
+        </w:rPr>
+        <w:t xml:space="preserve">: </w:t>
+      </w:r>
+      <w:r>
+        <w:rPr>
+          <w:rFonts w:ascii="Arial" w:hAnsi="Arial" w:cs="Arial"/>
+          <w:sz w:val="24"/>
+          <w:szCs w:val="24"/>
+        </w:rPr>
+        <w:t>Desenvolver uma funcionalidade de agendamento que substitua o uso ineficaz de ferramentas como Google Agenda, permitindo a criação, visualização e edição de compromissos em uma interface integrada, com notificações automáticas para os envolvidos.</w:t>
+      </w:r>
+    </w:p>
+    <w:p>
+      <w:pPr>
+        <w:pStyle w:val="PargrafodaLista"/>
+        <w:numPr>
+          <w:ilvl w:val="0"/>
+          <w:numId w:val="1"/>
+        </w:numPr>
+        <w:spacing w:after="0"/>
+        <w:jc w:val="both"/>
+        <w:rPr>
+          <w:rFonts w:ascii="Arial" w:hAnsi="Arial" w:cs="Arial"/>
+          <w:b/>
+          <w:bCs/>
+          <w:sz w:val="24"/>
+          <w:szCs w:val="24"/>
+        </w:rPr>
+      </w:pPr>
+      <w:r>
+        <w:rPr>
+          <w:rFonts w:ascii="Arial" w:hAnsi="Arial" w:cs="Arial"/>
+          <w:b/>
+          <w:bCs/>
+          <w:sz w:val="24"/>
+          <w:szCs w:val="24"/>
+        </w:rPr>
+        <w:t xml:space="preserve">Controle e atribuição de tarefas: </w:t>
+      </w:r>
+      <w:r>
+        <w:rPr>
+          <w:rFonts w:ascii="Arial" w:hAnsi="Arial" w:cs="Arial"/>
+          <w:sz w:val="24"/>
+          <w:szCs w:val="24"/>
+        </w:rPr>
+        <w:t xml:space="preserve">Criar um sistema de gerenciamento de tarefas que centralize a atribuição de responsabilidades entre </w:t>
+      </w:r>
+      <w:r>
+        <w:rPr>
+          <w:rFonts w:ascii="Arial" w:hAnsi="Arial" w:cs="Arial"/>
           <w:sz w:val="24"/>
           <w:szCs w:val="24"/>
         </w:rPr>
         <w:lastRenderedPageBreak/>
-        <w:t>Propósito do Projeto e Metas</w:t>
-      </w:r>
-    </w:p>
-    <w:p>
-      <w:pPr>
-        <w:jc w:val="both"/>
-        <w:rPr>
-          <w:rFonts w:ascii="Arial" w:hAnsi="Arial" w:cs="Arial"/>
-          <w:sz w:val="24"/>
-          <w:szCs w:val="24"/>
-        </w:rPr>
-      </w:pPr>
-      <w:r>
-        <w:rPr>
-          <w:rFonts w:ascii="Arial" w:hAnsi="Arial" w:cs="Arial"/>
-          <w:b/>
-          <w:bCs/>
+        <w:t>estagiários e supervisores, oferecendo lembretes automatizados (via interface, e-mai</w:t>
+      </w:r>
+      <w:r>
+        <w:rPr>
+          <w:rFonts w:ascii="Arial" w:hAnsi="Arial" w:cs="Arial"/>
+          <w:sz w:val="24"/>
+          <w:szCs w:val="24"/>
+        </w:rPr>
+        <w:t>l ou outros meios</w:t>
+      </w:r>
+      <w:r>
+        <w:rPr>
+          <w:rFonts w:ascii="Arial" w:hAnsi="Arial" w:cs="Arial"/>
+          <w:sz w:val="24"/>
+          <w:szCs w:val="24"/>
+        </w:rPr>
+        <w:t>)</w:t>
+      </w:r>
+      <w:r>
+        <w:rPr>
+          <w:rFonts w:ascii="Arial" w:hAnsi="Arial" w:cs="Arial"/>
+          <w:sz w:val="24"/>
+          <w:szCs w:val="24"/>
+        </w:rPr>
+        <w:t xml:space="preserve"> e reduzindo a dependência de post-its, garantindo o cumprimento de prazos e a supervisão eficiente das atividades.</w:t>
+      </w:r>
+    </w:p>
+    <w:p>
+      <w:pPr>
+        <w:spacing w:after="0"/>
+        <w:jc w:val="both"/>
+        <w:rPr>
+          <w:rFonts w:ascii="Arial" w:hAnsi="Arial" w:cs="Arial"/>
+          <w:sz w:val="24"/>
+          <w:szCs w:val="24"/>
+        </w:rPr>
+      </w:pPr>
+      <w:r>
+        <w:rPr>
+          <w:rFonts w:ascii="Arial" w:hAnsi="Arial" w:cs="Arial"/>
+          <w:sz w:val="24"/>
+          <w:szCs w:val="24"/>
+        </w:rPr>
+        <w:t>Com essas metas, o projeto busca unificar os procedimentos operacionais do NPJ em uma plataforma acessível e funcional, proporcionando maior autonomia aos estagiários sob supervisão controlada, diminuindo a sobrecarga dos advogados supervisores e alinhando-se aos objetivos educacionais da faculdade. A solução também pretende aumentar a produtividade da equipe, minimizar riscos de perda de informações e oferecer uma base tecnológica escalável para futuras melhorias</w:t>
+      </w:r>
+    </w:p>
+    <w:p>
+      <w:pPr>
+        <w:spacing w:before="240" w:after="0"/>
+        <w:jc w:val="both"/>
+        <w:rPr>
+          <w:rFonts w:ascii="Arial" w:hAnsi="Arial" w:cs="Arial"/>
+          <w:sz w:val="24"/>
+          <w:szCs w:val="24"/>
+        </w:rPr>
+      </w:pPr>
+      <w:r>
+        <w:rPr>
+          <w:rFonts w:ascii="Arial" w:hAnsi="Arial" w:cs="Arial"/>
           <w:sz w:val="24"/>
           <w:szCs w:val="24"/>
         </w:rPr>
@@ -545,64 +835,6 @@
           <w:sz w:val="24"/>
           <w:szCs w:val="24"/>
         </w:rPr>
-        <w:t xml:space="preserve">O objetivo do projeto é a digitalização e automatização dos processos de trabalho identificados, trazendo melhor fluidez para </w:t>
-      </w:r>
-      <w:r>
-        <w:rPr>
-          <w:rFonts w:ascii="Arial" w:hAnsi="Arial" w:cs="Arial"/>
-          <w:sz w:val="24"/>
-          <w:szCs w:val="24"/>
-        </w:rPr>
-        <w:t>as atividades</w:t>
-      </w:r>
-      <w:r>
-        <w:rPr>
-          <w:rFonts w:ascii="Arial" w:hAnsi="Arial" w:cs="Arial"/>
-          <w:sz w:val="24"/>
-          <w:szCs w:val="24"/>
-        </w:rPr>
-        <w:t xml:space="preserve"> realizad</w:t>
-      </w:r>
-      <w:r>
-        <w:rPr>
-          <w:rFonts w:ascii="Arial" w:hAnsi="Arial" w:cs="Arial"/>
-          <w:sz w:val="24"/>
-          <w:szCs w:val="24"/>
-        </w:rPr>
-        <w:t>as</w:t>
-      </w:r>
-      <w:r>
-        <w:rPr>
-          <w:rFonts w:ascii="Arial" w:hAnsi="Arial" w:cs="Arial"/>
-          <w:sz w:val="24"/>
-          <w:szCs w:val="24"/>
-        </w:rPr>
-        <w:t xml:space="preserve"> tanto pelos estagiários quanto pelos advogados presentes na unidade.</w:t>
-      </w:r>
-      <w:r>
-        <w:rPr>
-          <w:rFonts w:ascii="Arial" w:hAnsi="Arial" w:cs="Arial"/>
-          <w:sz w:val="24"/>
-          <w:szCs w:val="24"/>
-        </w:rPr>
-        <w:t xml:space="preserve"> Com a solução sistemica que será construida, vamos conseguir reunir em uma tela, todos os procedimentos que eram realizados de forma separada, desde o pré-cadastro do beneficiário, até o fechamento do caso e arquivamento de documentos.</w:t>
-      </w:r>
-    </w:p>
-    <w:p>
-      <w:pPr>
-        <w:jc w:val="both"/>
-        <w:rPr>
-          <w:rFonts w:ascii="Arial" w:hAnsi="Arial" w:cs="Arial"/>
-          <w:sz w:val="24"/>
-          <w:szCs w:val="24"/>
-        </w:rPr>
-      </w:pPr>
-      <w:r>
-        <w:rPr>
-          <w:rFonts w:ascii="Arial" w:hAnsi="Arial" w:cs="Arial"/>
-          <w:sz w:val="24"/>
-          <w:szCs w:val="24"/>
-        </w:rPr>
         <w:tab/>
       </w:r>
     </w:p>
@@ -630,6 +862,123 @@
     </w:p>
     <w:p>
       <w:pPr>
+        <w:spacing w:after="0"/>
+        <w:jc w:val="both"/>
+        <w:rPr>
+          <w:rFonts w:ascii="Arial" w:hAnsi="Arial" w:cs="Arial"/>
+          <w:sz w:val="24"/>
+          <w:szCs w:val="24"/>
+        </w:rPr>
+      </w:pPr>
+      <w:r>
+        <w:rPr>
+          <w:rFonts w:ascii="Arial" w:hAnsi="Arial" w:cs="Arial"/>
+          <w:b/>
+          <w:bCs/>
+          <w:sz w:val="24"/>
+          <w:szCs w:val="24"/>
+        </w:rPr>
+        <w:tab/>
+      </w:r>
+      <w:r>
+        <w:rPr>
+          <w:rFonts w:ascii="Arial" w:hAnsi="Arial" w:cs="Arial"/>
+          <w:sz w:val="24"/>
+          <w:szCs w:val="24"/>
+        </w:rPr>
+        <w:t>O projeto será dividido em cinco etapas: iniciação, planejamento, execução, monitoramento e finalização. Todas as etapas passaram em paralelo pela etapa de monitoramento, que será descrita a seguir. Os envolvidos no desenvolvimento do projeto</w:t>
+      </w:r>
+      <w:r>
+        <w:rPr>
+          <w:rFonts w:ascii="Arial" w:hAnsi="Arial" w:cs="Arial"/>
+          <w:sz w:val="24"/>
+          <w:szCs w:val="24"/>
+        </w:rPr>
+        <w:t xml:space="preserve"> se responsabilizaram por todo o processo de criação, validação, testes e acompanhamento da solução sistêmica descrita neste artefato. </w:t>
+      </w:r>
+    </w:p>
+    <w:p>
+      <w:pPr>
+        <w:spacing w:after="0"/>
+        <w:jc w:val="both"/>
+        <w:rPr>
+          <w:rFonts w:ascii="Arial" w:hAnsi="Arial" w:cs="Arial"/>
+          <w:sz w:val="24"/>
+          <w:szCs w:val="24"/>
+        </w:rPr>
+      </w:pPr>
+      <w:r>
+        <w:rPr>
+          <w:rFonts w:ascii="Arial" w:hAnsi="Arial" w:cs="Arial"/>
+          <w:sz w:val="24"/>
+          <w:szCs w:val="24"/>
+        </w:rPr>
+        <w:tab/>
+        <w:t xml:space="preserve">Na </w:t>
+      </w:r>
+    </w:p>
+    <w:p>
+      <w:pPr>
+        <w:jc w:val="both"/>
+        <w:rPr>
+          <w:rFonts w:ascii="Arial" w:hAnsi="Arial" w:cs="Arial"/>
+          <w:b/>
+          <w:bCs/>
+          <w:sz w:val="24"/>
+          <w:szCs w:val="24"/>
+        </w:rPr>
+      </w:pPr>
+    </w:p>
+    <w:p>
+      <w:pPr>
+        <w:jc w:val="both"/>
+        <w:rPr>
+          <w:rFonts w:ascii="Arial" w:hAnsi="Arial" w:cs="Arial"/>
+          <w:b/>
+          <w:bCs/>
+          <w:sz w:val="24"/>
+          <w:szCs w:val="24"/>
+        </w:rPr>
+      </w:pPr>
+    </w:p>
+    <w:p>
+      <w:pPr>
+        <w:jc w:val="both"/>
+        <w:rPr>
+          <w:rFonts w:ascii="Arial" w:hAnsi="Arial" w:cs="Arial"/>
+          <w:b/>
+          <w:bCs/>
+          <w:sz w:val="24"/>
+          <w:szCs w:val="24"/>
+        </w:rPr>
+      </w:pPr>
+    </w:p>
+    <w:p>
+      <w:pPr>
+        <w:jc w:val="both"/>
+        <w:rPr>
+          <w:rFonts w:ascii="Arial" w:hAnsi="Arial" w:cs="Arial"/>
+          <w:b/>
+          <w:bCs/>
+          <w:sz w:val="24"/>
+          <w:szCs w:val="24"/>
+        </w:rPr>
+      </w:pPr>
+    </w:p>
+    <w:p>
+      <w:pPr>
+        <w:jc w:val="both"/>
+        <w:rPr>
+          <w:rFonts w:ascii="Arial" w:hAnsi="Arial" w:cs="Arial"/>
+          <w:b/>
+          <w:bCs/>
+          <w:sz w:val="24"/>
+          <w:szCs w:val="24"/>
+        </w:rPr>
+      </w:pPr>
+    </w:p>
+    <w:p>
+      <w:pPr>
         <w:jc w:val="both"/>
         <w:rPr>
           <w:rFonts w:ascii="Arial" w:hAnsi="Arial" w:cs="Arial"/>
@@ -695,6 +1044,30 @@
         </w:rPr>
         <w:t>Restrições</w:t>
       </w:r>
+    </w:p>
+    <w:p>
+      <w:pPr>
+        <w:jc w:val="both"/>
+        <w:rPr>
+          <w:rFonts w:ascii="Arial" w:hAnsi="Arial" w:cs="Arial"/>
+          <w:b/>
+          <w:bCs/>
+          <w:sz w:val="24"/>
+          <w:szCs w:val="24"/>
+        </w:rPr>
+      </w:pPr>
+    </w:p>
+    <w:p>
+      <w:pPr>
+        <w:jc w:val="both"/>
+        <w:rPr>
+          <w:rFonts w:ascii="Arial" w:hAnsi="Arial" w:cs="Arial"/>
+          <w:b/>
+          <w:bCs/>
+          <w:sz w:val="24"/>
+          <w:szCs w:val="24"/>
+        </w:rPr>
+      </w:pPr>
     </w:p>
     <w:p>
       <w:pPr>
@@ -899,6 +1272,103 @@
     </w:sectPr>
   </w:body>
 </w:document>
+</file>
+
+<file path=word/numbering.xml><?xml version="1.0" encoding="utf-8"?>
+<w:numbering xmlns:wpc="http://schemas.microsoft.com/office/word/2010/wordprocessingCanvas" xmlns:cx="http://schemas.microsoft.com/office/drawing/2014/chartex" xmlns:cx1="http://schemas.microsoft.com/office/drawing/2015/9/8/chartex" xmlns:cx2="http://schemas.microsoft.com/office/drawing/2015/10/21/chartex" xmlns:cx3="http://schemas.microsoft.com/office/drawing/2016/5/9/chartex" xmlns:cx4="http://schemas.microsoft.com/office/drawing/2016/5/10/chartex" xmlns:cx5="http://schemas.microsoft.com/office/drawing/2016/5/11/chartex" xmlns:cx6="http://schemas.microsoft.com/office/drawing/2016/5/12/chartex" xmlns:cx7="http://schemas.microsoft.com/office/drawing/2016/5/13/chartex" xmlns:cx8="http://schemas.microsoft.com/office/drawing/2016/5/14/chartex" xmlns:mc="http://schemas.openxmlformats.org/markup-compatibility/2006" xmlns:aink="http://schemas.microsoft.com/office/drawing/2016/ink" xmlns:am3d="http://schemas.microsoft.com/office/drawing/2017/model3d" xmlns:o="urn:schemas-microsoft-com:office:office" xmlns:oel="http://schemas.microsoft.com/office/2019/extlst" xmlns:r="http://schemas.openxmlformats.org/officeDocument/2006/relationships" xmlns:m="http://schemas.openxmlformats.org/officeDocument/2006/math" xmlns:v="urn:schemas-microsoft-com:vml" xmlns:wp14="http://schemas.microsoft.com/office/word/2010/wordprocessingDrawing" xmlns:wp="http://schemas.openxmlformats.org/drawingml/2006/wordprocessingDrawing" xmlns:w10="urn:schemas-microsoft-com:office:word" xmlns:w="http://schemas.openxmlformats.org/wordprocessingml/2006/main" xmlns:w14="http://schemas.microsoft.com/office/word/2010/wordml" xmlns:w15="http://schemas.microsoft.com/office/word/2012/wordml" xmlns:w16cex="http://schemas.microsoft.com/office/word/2018/wordml/cex" xmlns:w16cid="http://schemas.microsoft.com/office/word/2016/wordml/cid" xmlns:w16="http://schemas.microsoft.com/office/word/2018/wordml" xmlns:w16du="http://schemas.microsoft.com/office/word/2023/wordml/word16du" xmlns:w16sdtdh="http://schemas.microsoft.com/office/word/2020/wordml/sdtdatahash" xmlns:w16sdtfl="http://schemas.microsoft.com/office/word/2024/wordml/sdtformatlock" xmlns:w16se="http://schemas.microsoft.com/office/word/2015/wordml/symex" xmlns:wpg="http://schemas.microsoft.com/office/word/2010/wordprocessingGroup" xmlns:wpi="http://schemas.microsoft.com/office/word/2010/wordprocessingInk" xmlns:wne="http://schemas.microsoft.com/office/word/2006/wordml" xmlns:wps="http://schemas.microsoft.com/office/word/2010/wordprocessingShape" mc:Ignorable="w14 w15 w16se w16cid w16 w16cex w16sdtdh w16sdtfl w16du wp14">
+  <w:abstractNum w:abstractNumId="0" w15:restartNumberingAfterBreak="0">
+    <w:nsid w:val="458C41C7"/>
+    <w:multiLevelType w:val="hybridMultilevel"/>
+    <w:tmpl w:val="4F841432"/>
+    <w:lvl w:ilvl="0" w:tplc="344A7914">
+      <w:start w:val="1"/>
+      <w:numFmt w:val="decimal"/>
+      <w:lvlText w:val="%1."/>
+      <w:lvlJc w:val="left"/>
+      <w:pPr>
+        <w:ind w:left="1065" w:hanging="360"/>
+      </w:pPr>
+      <w:rPr>
+        <w:rFonts w:hint="default"/>
+      </w:rPr>
+    </w:lvl>
+    <w:lvl w:ilvl="1" w:tplc="04160019" w:tentative="1">
+      <w:start w:val="1"/>
+      <w:numFmt w:val="lowerLetter"/>
+      <w:lvlText w:val="%2."/>
+      <w:lvlJc w:val="left"/>
+      <w:pPr>
+        <w:ind w:left="1785" w:hanging="360"/>
+      </w:pPr>
+    </w:lvl>
+    <w:lvl w:ilvl="2" w:tplc="0416001B" w:tentative="1">
+      <w:start w:val="1"/>
+      <w:numFmt w:val="lowerRoman"/>
+      <w:lvlText w:val="%3."/>
+      <w:lvlJc w:val="right"/>
+      <w:pPr>
+        <w:ind w:left="2505" w:hanging="180"/>
+      </w:pPr>
+    </w:lvl>
+    <w:lvl w:ilvl="3" w:tplc="0416000F" w:tentative="1">
+      <w:start w:val="1"/>
+      <w:numFmt w:val="decimal"/>
+      <w:lvlText w:val="%4."/>
+      <w:lvlJc w:val="left"/>
+      <w:pPr>
+        <w:ind w:left="3225" w:hanging="360"/>
+      </w:pPr>
+    </w:lvl>
+    <w:lvl w:ilvl="4" w:tplc="04160019" w:tentative="1">
+      <w:start w:val="1"/>
+      <w:numFmt w:val="lowerLetter"/>
+      <w:lvlText w:val="%5."/>
+      <w:lvlJc w:val="left"/>
+      <w:pPr>
+        <w:ind w:left="3945" w:hanging="360"/>
+      </w:pPr>
+    </w:lvl>
+    <w:lvl w:ilvl="5" w:tplc="0416001B" w:tentative="1">
+      <w:start w:val="1"/>
+      <w:numFmt w:val="lowerRoman"/>
+      <w:lvlText w:val="%6."/>
+      <w:lvlJc w:val="right"/>
+      <w:pPr>
+        <w:ind w:left="4665" w:hanging="180"/>
+      </w:pPr>
+    </w:lvl>
+    <w:lvl w:ilvl="6" w:tplc="0416000F" w:tentative="1">
+      <w:start w:val="1"/>
+      <w:numFmt w:val="decimal"/>
+      <w:lvlText w:val="%7."/>
+      <w:lvlJc w:val="left"/>
+      <w:pPr>
+        <w:ind w:left="5385" w:hanging="360"/>
+      </w:pPr>
+    </w:lvl>
+    <w:lvl w:ilvl="7" w:tplc="04160019" w:tentative="1">
+      <w:start w:val="1"/>
+      <w:numFmt w:val="lowerLetter"/>
+      <w:lvlText w:val="%8."/>
+      <w:lvlJc w:val="left"/>
+      <w:pPr>
+        <w:ind w:left="6105" w:hanging="360"/>
+      </w:pPr>
+    </w:lvl>
+    <w:lvl w:ilvl="8" w:tplc="0416001B" w:tentative="1">
+      <w:start w:val="1"/>
+      <w:numFmt w:val="lowerRoman"/>
+      <w:lvlText w:val="%9."/>
+      <w:lvlJc w:val="right"/>
+      <w:pPr>
+        <w:ind w:left="6825" w:hanging="180"/>
+      </w:pPr>
+    </w:lvl>
+  </w:abstractNum>
+  <w:num w:numId="1" w16cid:durableId="2093773365">
+    <w:abstractNumId w:val="0"/>
+  </w:num>
+</w:numbering>
 </file>
 
 <file path=word/styles.xml><?xml version="1.0" encoding="utf-8"?>

</xml_diff>

<commit_message>
melhoria na imagem da EAP e continuação do TAP
</commit_message>
<xml_diff>
--- a/docs/TermoAberturaProjetoNPJ.docx
+++ b/docs/TermoAberturaProjetoNPJ.docx
@@ -40,33 +40,19 @@
         <w:jc w:val="both"/>
         <w:rPr>
           <w:rFonts w:ascii="Arial" w:hAnsi="Arial" w:cs="Arial"/>
-          <w:sz w:val="24"/>
-          <w:szCs w:val="24"/>
-        </w:rPr>
-      </w:pPr>
-      <w:r>
-        <w:rPr>
-          <w:rFonts w:ascii="Arial" w:hAnsi="Arial" w:cs="Arial"/>
-          <w:sz w:val="24"/>
-          <w:szCs w:val="24"/>
-        </w:rPr>
-        <w:t xml:space="preserve">O documento do Termo de Abertura do Projeto tem como objetivo formalizar o início do projeto e descrever todas as suas etapas, justificativas, premissas, riscos, restrições, marcos e partes interessadas. </w:t>
-      </w:r>
-      <w:r>
-        <w:rPr>
-          <w:rFonts w:ascii="Arial" w:hAnsi="Arial" w:cs="Arial"/>
-          <w:sz w:val="24"/>
-          <w:szCs w:val="24"/>
-        </w:rPr>
-        <w:t>Neste documento são abordadas as etapas a serem seguidas para o desenvolvimento do software, e ao reunir estas informações sobre o contexto do projeto, como a justificava do negócio, os requisitos iniciais e os riscos identificados</w:t>
-      </w:r>
-      <w:r>
-        <w:rPr>
-          <w:rFonts w:ascii="Arial" w:hAnsi="Arial" w:cs="Arial"/>
-          <w:sz w:val="24"/>
-          <w:szCs w:val="24"/>
-        </w:rPr>
-        <w:t>.</w:t>
+          <w:color w:val="FF0000"/>
+          <w:sz w:val="24"/>
+          <w:szCs w:val="24"/>
+        </w:rPr>
+      </w:pPr>
+      <w:r>
+        <w:rPr>
+          <w:rFonts w:ascii="Arial" w:hAnsi="Arial" w:cs="Arial"/>
+          <w:color w:val="FF0000"/>
+          <w:sz w:val="24"/>
+          <w:szCs w:val="24"/>
+        </w:rPr>
+        <w:t>O documento do Termo de Abertura do Projeto tem como objetivo formalizar o início do projeto e descrever todas as suas etapas, justificativas, premissas, riscos, restrições, marcos e partes interessadas. Neste documento são abordadas as etapas a serem seguidas para o desenvolvimento do software, e ao reunir estas informações sobre o contexto do projeto, como a justificava do negócio, os requisitos iniciais e os riscos identificados.</w:t>
       </w:r>
     </w:p>
     <w:p>
@@ -845,15 +831,17 @@
           <w:rFonts w:ascii="Arial" w:hAnsi="Arial" w:cs="Arial"/>
           <w:b/>
           <w:bCs/>
-          <w:sz w:val="24"/>
-          <w:szCs w:val="24"/>
-        </w:rPr>
-      </w:pPr>
-      <w:r>
-        <w:rPr>
-          <w:rFonts w:ascii="Arial" w:hAnsi="Arial" w:cs="Arial"/>
-          <w:b/>
-          <w:bCs/>
+          <w:color w:val="FF0000"/>
+          <w:sz w:val="24"/>
+          <w:szCs w:val="24"/>
+        </w:rPr>
+      </w:pPr>
+      <w:r>
+        <w:rPr>
+          <w:rFonts w:ascii="Arial" w:hAnsi="Arial" w:cs="Arial"/>
+          <w:b/>
+          <w:bCs/>
+          <w:color w:val="FF0000"/>
           <w:sz w:val="24"/>
           <w:szCs w:val="24"/>
         </w:rPr>
@@ -866,15 +854,17 @@
         <w:jc w:val="both"/>
         <w:rPr>
           <w:rFonts w:ascii="Arial" w:hAnsi="Arial" w:cs="Arial"/>
-          <w:sz w:val="24"/>
-          <w:szCs w:val="24"/>
-        </w:rPr>
-      </w:pPr>
-      <w:r>
-        <w:rPr>
-          <w:rFonts w:ascii="Arial" w:hAnsi="Arial" w:cs="Arial"/>
-          <w:b/>
-          <w:bCs/>
+          <w:color w:val="FF0000"/>
+          <w:sz w:val="24"/>
+          <w:szCs w:val="24"/>
+        </w:rPr>
+      </w:pPr>
+      <w:r>
+        <w:rPr>
+          <w:rFonts w:ascii="Arial" w:hAnsi="Arial" w:cs="Arial"/>
+          <w:b/>
+          <w:bCs/>
+          <w:color w:val="FF0000"/>
           <w:sz w:val="24"/>
           <w:szCs w:val="24"/>
         </w:rPr>
@@ -883,6 +873,7 @@
       <w:r>
         <w:rPr>
           <w:rFonts w:ascii="Arial" w:hAnsi="Arial" w:cs="Arial"/>
+          <w:color w:val="FF0000"/>
           <w:sz w:val="24"/>
           <w:szCs w:val="24"/>
         </w:rPr>
@@ -891,6 +882,7 @@
       <w:r>
         <w:rPr>
           <w:rFonts w:ascii="Arial" w:hAnsi="Arial" w:cs="Arial"/>
+          <w:color w:val="FF0000"/>
           <w:sz w:val="24"/>
           <w:szCs w:val="24"/>
         </w:rPr>
@@ -903,108 +895,70 @@
         <w:jc w:val="both"/>
         <w:rPr>
           <w:rFonts w:ascii="Arial" w:hAnsi="Arial" w:cs="Arial"/>
-          <w:sz w:val="24"/>
-          <w:szCs w:val="24"/>
-        </w:rPr>
-      </w:pPr>
-      <w:r>
-        <w:rPr>
-          <w:rFonts w:ascii="Arial" w:hAnsi="Arial" w:cs="Arial"/>
+          <w:color w:val="FF0000"/>
+          <w:sz w:val="24"/>
+          <w:szCs w:val="24"/>
+        </w:rPr>
+      </w:pPr>
+      <w:r>
+        <w:rPr>
+          <w:rFonts w:ascii="Arial" w:hAnsi="Arial" w:cs="Arial"/>
+          <w:color w:val="FF0000"/>
           <w:sz w:val="24"/>
           <w:szCs w:val="24"/>
         </w:rPr>
         <w:tab/>
         <w:t xml:space="preserve">Na </w:t>
       </w:r>
-    </w:p>
-    <w:p>
-      <w:pPr>
-        <w:jc w:val="both"/>
-        <w:rPr>
-          <w:rFonts w:ascii="Arial" w:hAnsi="Arial" w:cs="Arial"/>
-          <w:b/>
-          <w:bCs/>
-          <w:sz w:val="24"/>
-          <w:szCs w:val="24"/>
-        </w:rPr>
-      </w:pPr>
-    </w:p>
-    <w:p>
-      <w:pPr>
-        <w:jc w:val="both"/>
-        <w:rPr>
-          <w:rFonts w:ascii="Arial" w:hAnsi="Arial" w:cs="Arial"/>
-          <w:b/>
-          <w:bCs/>
-          <w:sz w:val="24"/>
-          <w:szCs w:val="24"/>
-        </w:rPr>
-      </w:pPr>
-    </w:p>
-    <w:p>
-      <w:pPr>
-        <w:jc w:val="both"/>
-        <w:rPr>
-          <w:rFonts w:ascii="Arial" w:hAnsi="Arial" w:cs="Arial"/>
-          <w:b/>
-          <w:bCs/>
-          <w:sz w:val="24"/>
-          <w:szCs w:val="24"/>
-        </w:rPr>
-      </w:pPr>
-    </w:p>
-    <w:p>
-      <w:pPr>
-        <w:jc w:val="both"/>
-        <w:rPr>
-          <w:rFonts w:ascii="Arial" w:hAnsi="Arial" w:cs="Arial"/>
-          <w:b/>
-          <w:bCs/>
-          <w:sz w:val="24"/>
-          <w:szCs w:val="24"/>
-        </w:rPr>
-      </w:pPr>
-    </w:p>
-    <w:p>
-      <w:pPr>
-        <w:jc w:val="both"/>
-        <w:rPr>
-          <w:rFonts w:ascii="Arial" w:hAnsi="Arial" w:cs="Arial"/>
-          <w:b/>
-          <w:bCs/>
-          <w:sz w:val="24"/>
-          <w:szCs w:val="24"/>
-        </w:rPr>
-      </w:pPr>
-    </w:p>
-    <w:p>
-      <w:pPr>
-        <w:jc w:val="both"/>
-        <w:rPr>
-          <w:rFonts w:ascii="Arial" w:hAnsi="Arial" w:cs="Arial"/>
-          <w:b/>
-          <w:bCs/>
-          <w:sz w:val="24"/>
-          <w:szCs w:val="24"/>
-        </w:rPr>
-      </w:pPr>
-    </w:p>
-    <w:p>
-      <w:pPr>
-        <w:jc w:val="both"/>
-        <w:rPr>
-          <w:rFonts w:ascii="Arial" w:hAnsi="Arial" w:cs="Arial"/>
-          <w:b/>
-          <w:bCs/>
-          <w:sz w:val="24"/>
-          <w:szCs w:val="24"/>
-        </w:rPr>
-      </w:pPr>
-      <w:r>
-        <w:rPr>
-          <w:rFonts w:ascii="Arial" w:hAnsi="Arial" w:cs="Arial"/>
-          <w:b/>
-          <w:bCs/>
+      <w:r>
+        <w:rPr>
+          <w:rFonts w:ascii="Arial" w:hAnsi="Arial" w:cs="Arial"/>
+          <w:color w:val="FF0000"/>
+          <w:sz w:val="24"/>
+          <w:szCs w:val="24"/>
+        </w:rPr>
+        <w:t xml:space="preserve">iniciação do projeto foi realizada uma análise de oportunidade de negócio, seguida de </w:t>
+      </w:r>
+      <w:r>
+        <w:rPr>
+          <w:rFonts w:ascii="Arial" w:hAnsi="Arial" w:cs="Arial"/>
+          <w:color w:val="FF0000"/>
+          <w:sz w:val="24"/>
+          <w:szCs w:val="24"/>
+        </w:rPr>
+        <w:t>...</w:t>
+      </w:r>
+    </w:p>
+    <w:p>
+      <w:pPr>
+        <w:spacing w:after="0"/>
+        <w:jc w:val="both"/>
+        <w:rPr>
+          <w:rFonts w:ascii="Arial" w:hAnsi="Arial" w:cs="Arial"/>
+          <w:color w:val="FF0000"/>
+          <w:sz w:val="24"/>
+          <w:szCs w:val="24"/>
+        </w:rPr>
+      </w:pPr>
+    </w:p>
+    <w:p>
+      <w:pPr>
+        <w:jc w:val="both"/>
+        <w:rPr>
+          <w:rFonts w:ascii="Arial" w:hAnsi="Arial" w:cs="Arial"/>
+          <w:b/>
+          <w:bCs/>
+          <w:color w:val="FF0000"/>
+          <w:sz w:val="24"/>
+          <w:szCs w:val="24"/>
+        </w:rPr>
+      </w:pPr>
+      <w:r>
+        <w:rPr>
+          <w:rFonts w:ascii="Arial" w:hAnsi="Arial" w:cs="Arial"/>
+          <w:b/>
+          <w:bCs/>
+          <w:color w:val="FF0000"/>
           <w:sz w:val="24"/>
           <w:szCs w:val="24"/>
         </w:rPr>
@@ -1018,27 +972,17 @@
           <w:rFonts w:ascii="Arial" w:hAnsi="Arial" w:cs="Arial"/>
           <w:b/>
           <w:bCs/>
-          <w:sz w:val="24"/>
-          <w:szCs w:val="24"/>
-        </w:rPr>
-      </w:pPr>
-    </w:p>
-    <w:p>
-      <w:pPr>
-        <w:jc w:val="both"/>
-        <w:rPr>
-          <w:rFonts w:ascii="Arial" w:hAnsi="Arial" w:cs="Arial"/>
-          <w:b/>
-          <w:bCs/>
-          <w:sz w:val="24"/>
-          <w:szCs w:val="24"/>
-        </w:rPr>
-      </w:pPr>
-      <w:r>
-        <w:rPr>
-          <w:rFonts w:ascii="Arial" w:hAnsi="Arial" w:cs="Arial"/>
-          <w:b/>
-          <w:bCs/>
+          <w:color w:val="FF0000"/>
+          <w:sz w:val="24"/>
+          <w:szCs w:val="24"/>
+        </w:rPr>
+      </w:pPr>
+      <w:r>
+        <w:rPr>
+          <w:rFonts w:ascii="Arial" w:hAnsi="Arial" w:cs="Arial"/>
+          <w:b/>
+          <w:bCs/>
+          <w:color w:val="FF0000"/>
           <w:sz w:val="24"/>
           <w:szCs w:val="24"/>
         </w:rPr>
@@ -1052,51 +996,17 @@
           <w:rFonts w:ascii="Arial" w:hAnsi="Arial" w:cs="Arial"/>
           <w:b/>
           <w:bCs/>
-          <w:sz w:val="24"/>
-          <w:szCs w:val="24"/>
-        </w:rPr>
-      </w:pPr>
-    </w:p>
-    <w:p>
-      <w:pPr>
-        <w:jc w:val="both"/>
-        <w:rPr>
-          <w:rFonts w:ascii="Arial" w:hAnsi="Arial" w:cs="Arial"/>
-          <w:b/>
-          <w:bCs/>
-          <w:sz w:val="24"/>
-          <w:szCs w:val="24"/>
-        </w:rPr>
-      </w:pPr>
-    </w:p>
-    <w:p>
-      <w:pPr>
-        <w:jc w:val="both"/>
-        <w:rPr>
-          <w:rFonts w:ascii="Arial" w:hAnsi="Arial" w:cs="Arial"/>
-          <w:b/>
-          <w:bCs/>
-          <w:sz w:val="24"/>
-          <w:szCs w:val="24"/>
-        </w:rPr>
-      </w:pPr>
-    </w:p>
-    <w:p>
-      <w:pPr>
-        <w:jc w:val="both"/>
-        <w:rPr>
-          <w:rFonts w:ascii="Arial" w:hAnsi="Arial" w:cs="Arial"/>
-          <w:b/>
-          <w:bCs/>
-          <w:sz w:val="24"/>
-          <w:szCs w:val="24"/>
-        </w:rPr>
-      </w:pPr>
-      <w:r>
-        <w:rPr>
-          <w:rFonts w:ascii="Arial" w:hAnsi="Arial" w:cs="Arial"/>
-          <w:b/>
-          <w:bCs/>
+          <w:color w:val="FF0000"/>
+          <w:sz w:val="24"/>
+          <w:szCs w:val="24"/>
+        </w:rPr>
+      </w:pPr>
+      <w:r>
+        <w:rPr>
+          <w:rFonts w:ascii="Arial" w:hAnsi="Arial" w:cs="Arial"/>
+          <w:b/>
+          <w:bCs/>
+          <w:color w:val="FF0000"/>
           <w:sz w:val="24"/>
           <w:szCs w:val="24"/>
         </w:rPr>
@@ -1110,27 +1020,17 @@
           <w:rFonts w:ascii="Arial" w:hAnsi="Arial" w:cs="Arial"/>
           <w:b/>
           <w:bCs/>
-          <w:sz w:val="24"/>
-          <w:szCs w:val="24"/>
-        </w:rPr>
-      </w:pPr>
-    </w:p>
-    <w:p>
-      <w:pPr>
-        <w:jc w:val="both"/>
-        <w:rPr>
-          <w:rFonts w:ascii="Arial" w:hAnsi="Arial" w:cs="Arial"/>
-          <w:b/>
-          <w:bCs/>
-          <w:sz w:val="24"/>
-          <w:szCs w:val="24"/>
-        </w:rPr>
-      </w:pPr>
-      <w:r>
-        <w:rPr>
-          <w:rFonts w:ascii="Arial" w:hAnsi="Arial" w:cs="Arial"/>
-          <w:b/>
-          <w:bCs/>
+          <w:color w:val="FF0000"/>
+          <w:sz w:val="24"/>
+          <w:szCs w:val="24"/>
+        </w:rPr>
+      </w:pPr>
+      <w:r>
+        <w:rPr>
+          <w:rFonts w:ascii="Arial" w:hAnsi="Arial" w:cs="Arial"/>
+          <w:b/>
+          <w:bCs/>
+          <w:color w:val="FF0000"/>
           <w:sz w:val="24"/>
           <w:szCs w:val="24"/>
         </w:rPr>
@@ -1144,44 +1044,22 @@
           <w:rFonts w:ascii="Arial" w:hAnsi="Arial" w:cs="Arial"/>
           <w:b/>
           <w:bCs/>
-          <w:sz w:val="24"/>
-          <w:szCs w:val="24"/>
-        </w:rPr>
-      </w:pPr>
-    </w:p>
-    <w:p>
-      <w:pPr>
-        <w:jc w:val="both"/>
-        <w:rPr>
-          <w:rFonts w:ascii="Arial" w:hAnsi="Arial" w:cs="Arial"/>
-          <w:b/>
-          <w:bCs/>
-          <w:sz w:val="24"/>
-          <w:szCs w:val="24"/>
-        </w:rPr>
-      </w:pPr>
-      <w:r>
-        <w:rPr>
-          <w:rFonts w:ascii="Arial" w:hAnsi="Arial" w:cs="Arial"/>
-          <w:b/>
-          <w:bCs/>
+          <w:color w:val="FF0000"/>
+          <w:sz w:val="24"/>
+          <w:szCs w:val="24"/>
+        </w:rPr>
+      </w:pPr>
+      <w:r>
+        <w:rPr>
+          <w:rFonts w:ascii="Arial" w:hAnsi="Arial" w:cs="Arial"/>
+          <w:b/>
+          <w:bCs/>
+          <w:color w:val="FF0000"/>
           <w:sz w:val="24"/>
           <w:szCs w:val="24"/>
         </w:rPr>
         <w:t>Marco</w:t>
       </w:r>
-    </w:p>
-    <w:p>
-      <w:pPr>
-        <w:jc w:val="both"/>
-        <w:rPr>
-          <w:rFonts w:ascii="Arial" w:hAnsi="Arial" w:cs="Arial"/>
-          <w:b/>
-          <w:bCs/>
-          <w:sz w:val="24"/>
-          <w:szCs w:val="24"/>
-        </w:rPr>
-      </w:pPr>
     </w:p>
     <w:p>
       <w:pPr>

</xml_diff>